<commit_message>
docs(ka): rename system to 10X LMS across document and screenshots
Replace placeholder product name with the actual system name (10X LMS)
in the .docx, .html, and all seven UI screenshots. Content and length
unchanged — brief, expert-facing description (~8-9 pages).

Co-Authored-By: Claude Opus 4.8 <noreply@anthropic.com>
Claude-Session: https://claude.ai/code/session_01Us3Ac3qkLTDqYwgqqq2EGx
</commit_message>
<xml_diff>
--- a/docs/ka/LMS-sistemis-aghwera-KA.docx
+++ b/docs/ka/LMS-sistemis-aghwera-KA.docx
@@ -16,7 +16,7 @@
           <w:sz w:val="26"/>
           <w:szCs w:val="26"/>
         </w:rPr>
-        <w:t xml:space="preserve">EduCore LMS</w:t>
+        <w:t xml:space="preserve">10X LMS</w:t>
       </w:r>
     </w:p>
     <w:p>
@@ -399,7 +399,7 @@
           <w:sz w:val="21"/>
           <w:szCs w:val="21"/>
         </w:rPr>
-        <w:t xml:space="preserve">EduCore LMS არის სასწავლო პროცესის მართვის ერთიანი პლატფორმა, რომელიც სრულად ფარავს სწავლების ციკლს — პროგრამის დაგეგმვიდან და კურსების აწყობიდან დაწყებული, სტუდენტის ყოველდღიური სწავლითა და შეფასებით დამთავრებული. სისტემა აერთიანებს ადმინისტრირებას, სწავლებას, შეფასებასა და ანალიტიკას ერთ სივრცეში, სადაც ყველა მონაცემი დაკავშირებულია და თანმიმდევრულია.</w:t>
+        <w:t xml:space="preserve">10X LMS არის სასწავლო პროცესის მართვის ერთიანი პლატფორმა, რომელიც სრულად ფარავს სწავლების ციკლს — პროგრამის დაგეგმვიდან და კურსების აწყობიდან დაწყებული, სტუდენტის ყოველდღიური სწავლითა და შეფასებით დამთავრებული. სისტემა აერთიანებს ადმინისტრირებას, სწავლებას, შეფასებასა და ანალიტიკას ერთ სივრცეში, სადაც ყველა მონაცემი დაკავშირებულია და თანმიმდევრულია.</w:t>
       </w:r>
     </w:p>
     <w:p>
@@ -4982,7 +4982,7 @@
           <w:sz w:val="21"/>
           <w:szCs w:val="21"/>
         </w:rPr>
-        <w:t xml:space="preserve">EduCore LMS აერთიანებს ადმინისტრირებას, სწავლებას, შეფასებასა და აკადემიური კეთილსინდისიერების კონტროლს ერთ თანმიმდევრულ სისტემაში. მკაფიოდ გამიჯნული როლები უზრუნველყოფს უსაფრთხოებას და პასუხისმგებლობის განაწილებას; მოქნილი შეფასების მოდელები — ობიექტურ და ავტომატიზებულ შეფასებას; ხოლო სპეციალიზებული აპლიკაციები მასწავლებელსა და სტუდენტს სთავაზობს მათზე მორგებულ, თანამედროვე გამოცდილებას. ონლაინ შეფასების დაცული რეჟიმი კი უზრუნველყოფს შედეგების სანდოობას როგორც ვებ-, ისე მობილურ პლატფორმაზე.</w:t>
+        <w:t xml:space="preserve">10X LMS აერთიანებს ადმინისტრირებას, სწავლებას, შეფასებასა და აკადემიური კეთილსინდისიერების კონტროლს ერთ თანმიმდევრულ სისტემაში. მკაფიოდ გამიჯნული როლები უზრუნველყოფს უსაფრთხოებას და პასუხისმგებლობის განაწილებას; მოქნილი შეფასების მოდელები — ობიექტურ და ავტომატიზებულ შეფასებას; ხოლო სპეციალიზებული აპლიკაციები მასწავლებელსა და სტუდენტს სთავაზობს მათზე მორგებულ, თანამედროვე გამოცდილებას. ონლაინ შეფასების დაცული რეჟიმი კი უზრუნველყოფს შედეგების სანდოობას როგორც ვებ-, ისე მობილურ პლატფორმაზე.</w:t>
       </w:r>
     </w:p>
     <w:sectPr>
@@ -5122,7 +5122,7 @@
         <w:sz w:val="15"/>
         <w:szCs w:val="15"/>
       </w:rPr>
-      <w:t xml:space="preserve">EduCore LMS · სისტემის აღწერა</w:t>
+      <w:t xml:space="preserve">10X LMS · სისტემის აღწერა</w:t>
     </w:r>
   </w:p>
 </w:hdr>

</xml_diff>